<commit_message>
feature: add 'sacado' fields to CPV forms and documents, implement confirmation term generation
</commit_message>
<xml_diff>
--- a/doc_templates/termo_cessao.docx
+++ b/doc_templates/termo_cessao.docx
@@ -5859,16 +5859,9 @@
         </w:rPr>
       </w:pPr>
     </w:p>
-    <w:p>
-      <w:pPr>
-        <w:rPr>
-          <w:lang w:val="pt-BR"/>
-        </w:rPr>
-      </w:pPr>
-    </w:p>
     <w:tbl>
       <w:tblPr>
-        <w:tblW w:w="9536" w:type="dxa"/>
+        <w:tblW w:w="9552" w:type="dxa"/>
         <w:tblCellMar>
           <w:left w:w="70" w:type="dxa"/>
           <w:right w:w="70" w:type="dxa"/>
@@ -5876,17 +5869,17 @@
         <w:tblLook w:val="04A0" w:firstRow="1" w:lastRow="0" w:firstColumn="1" w:lastColumn="0" w:noHBand="0" w:noVBand="1"/>
       </w:tblPr>
       <w:tblGrid>
-        <w:gridCol w:w="2091"/>
-        <w:gridCol w:w="4037"/>
-        <w:gridCol w:w="3408"/>
+        <w:gridCol w:w="2095"/>
+        <w:gridCol w:w="4043"/>
+        <w:gridCol w:w="3414"/>
       </w:tblGrid>
       <w:tr>
         <w:trPr>
-          <w:trHeight w:val="375"/>
+          <w:trHeight w:val="369"/>
         </w:trPr>
         <w:tc>
           <w:tcPr>
-            <w:tcW w:w="6128" w:type="dxa"/>
+            <w:tcW w:w="6138" w:type="dxa"/>
             <w:gridSpan w:val="2"/>
             <w:tcBorders>
               <w:top w:val="single" w:sz="4" w:space="0" w:color="auto"/>
@@ -5918,6 +5911,7 @@
                 <w:color w:val="000000"/>
                 <w:sz w:val="22"/>
                 <w:szCs w:val="22"/>
+                <w:lang w:val="pt-BR"/>
               </w:rPr>
               <w:t>CESSIONÁRIO / CREDOR</w:t>
             </w:r>
@@ -5925,7 +5919,7 @@
         </w:tc>
         <w:tc>
           <w:tcPr>
-            <w:tcW w:w="3408" w:type="dxa"/>
+            <w:tcW w:w="3414" w:type="dxa"/>
             <w:tcBorders>
               <w:top w:val="single" w:sz="4" w:space="0" w:color="auto"/>
               <w:left w:val="nil"/>
@@ -5963,11 +5957,11 @@
       </w:tr>
       <w:tr>
         <w:trPr>
-          <w:trHeight w:val="375"/>
+          <w:trHeight w:val="369"/>
         </w:trPr>
         <w:tc>
           <w:tcPr>
-            <w:tcW w:w="2091" w:type="dxa"/>
+            <w:tcW w:w="2095" w:type="dxa"/>
             <w:tcBorders>
               <w:top w:val="nil"/>
               <w:left w:val="single" w:sz="4" w:space="0" w:color="auto"/>
@@ -6005,7 +5999,7 @@
         </w:tc>
         <w:tc>
           <w:tcPr>
-            <w:tcW w:w="4037" w:type="dxa"/>
+            <w:tcW w:w="4042" w:type="dxa"/>
             <w:tcBorders>
               <w:top w:val="nil"/>
               <w:left w:val="nil"/>
@@ -6032,7 +6026,7 @@
         </w:tc>
         <w:tc>
           <w:tcPr>
-            <w:tcW w:w="3408" w:type="dxa"/>
+            <w:tcW w:w="3414" w:type="dxa"/>
             <w:tcBorders>
               <w:top w:val="nil"/>
               <w:left w:val="nil"/>
@@ -6071,11 +6065,11 @@
       </w:tr>
       <w:tr>
         <w:trPr>
-          <w:trHeight w:val="375"/>
+          <w:trHeight w:val="369"/>
         </w:trPr>
         <w:tc>
           <w:tcPr>
-            <w:tcW w:w="9536" w:type="dxa"/>
+            <w:tcW w:w="9552" w:type="dxa"/>
             <w:gridSpan w:val="3"/>
             <w:tcBorders>
               <w:top w:val="nil"/>
@@ -6111,11 +6105,11 @@
       </w:tr>
       <w:tr>
         <w:trPr>
-          <w:trHeight w:val="375"/>
+          <w:trHeight w:val="369"/>
         </w:trPr>
         <w:tc>
           <w:tcPr>
-            <w:tcW w:w="9536" w:type="dxa"/>
+            <w:tcW w:w="9552" w:type="dxa"/>
             <w:gridSpan w:val="3"/>
             <w:tcBorders>
               <w:top w:val="nil"/>
@@ -6171,11 +6165,11 @@
       </w:tr>
       <w:tr>
         <w:trPr>
-          <w:trHeight w:val="375"/>
+          <w:trHeight w:val="369"/>
         </w:trPr>
         <w:tc>
           <w:tcPr>
-            <w:tcW w:w="9536" w:type="dxa"/>
+            <w:tcW w:w="9552" w:type="dxa"/>
             <w:gridSpan w:val="3"/>
             <w:tcBorders>
               <w:top w:val="nil"/>
@@ -6211,124 +6205,11 @@
       </w:tr>
       <w:tr>
         <w:trPr>
-          <w:trHeight w:val="375"/>
+          <w:trHeight w:val="369"/>
         </w:trPr>
         <w:tc>
           <w:tcPr>
-            <w:tcW w:w="2091" w:type="dxa"/>
-            <w:tcBorders>
-              <w:top w:val="nil"/>
-              <w:left w:val="single" w:sz="4" w:space="0" w:color="auto"/>
-              <w:bottom w:val="nil"/>
-              <w:right w:val="nil"/>
-            </w:tcBorders>
-            <w:noWrap/>
-            <w:vAlign w:val="center"/>
-            <w:hideMark/>
-          </w:tcPr>
-          <w:p>
-            <w:pPr>
-              <w:rPr>
-                <w:rFonts w:ascii="Calibri" w:hAnsi="Calibri" w:cs="Calibri"/>
-                <w:color w:val="000000"/>
-                <w:sz w:val="22"/>
-                <w:szCs w:val="22"/>
-              </w:rPr>
-            </w:pPr>
-            <w:proofErr w:type="spellStart"/>
-            <w:r>
-              <w:rPr>
-                <w:rFonts w:ascii="Calibri" w:hAnsi="Calibri" w:cs="Calibri"/>
-                <w:color w:val="000000"/>
-                <w:sz w:val="22"/>
-                <w:szCs w:val="22"/>
-              </w:rPr>
-              <w:t>Razão</w:t>
-            </w:r>
-            <w:proofErr w:type="spellEnd"/>
-            <w:r>
-              <w:rPr>
-                <w:rFonts w:ascii="Calibri" w:hAnsi="Calibri" w:cs="Calibri"/>
-                <w:color w:val="000000"/>
-                <w:sz w:val="22"/>
-                <w:szCs w:val="22"/>
-              </w:rPr>
-              <w:t xml:space="preserve"> Social:</w:t>
-            </w:r>
-          </w:p>
-        </w:tc>
-        <w:tc>
-          <w:tcPr>
-            <w:tcW w:w="7445" w:type="dxa"/>
-            <w:gridSpan w:val="2"/>
-            <w:tcBorders>
-              <w:top w:val="nil"/>
-              <w:left w:val="nil"/>
-              <w:bottom w:val="nil"/>
-              <w:right w:val="single" w:sz="4" w:space="0" w:color="000000"/>
-            </w:tcBorders>
-            <w:vAlign w:val="center"/>
-            <w:hideMark/>
-          </w:tcPr>
-          <w:p>
-            <w:pPr>
-              <w:rPr>
-                <w:rFonts w:ascii="Calibri" w:hAnsi="Calibri" w:cs="Calibri"/>
-                <w:color w:val="000000"/>
-                <w:sz w:val="22"/>
-                <w:szCs w:val="22"/>
-              </w:rPr>
-            </w:pPr>
-            <w:proofErr w:type="gramStart"/>
-            <w:r>
-              <w:rPr>
-                <w:rFonts w:ascii="Calibri" w:hAnsi="Calibri" w:cs="Calibri"/>
-                <w:color w:val="000000"/>
-                <w:sz w:val="22"/>
-                <w:szCs w:val="22"/>
-              </w:rPr>
-              <w:t xml:space="preserve">{{ </w:t>
-            </w:r>
-            <w:proofErr w:type="spellStart"/>
-            <w:r>
-              <w:rPr>
-                <w:rFonts w:ascii="Calibri" w:hAnsi="Calibri" w:cs="Calibri"/>
-                <w:color w:val="000000"/>
-                <w:sz w:val="22"/>
-                <w:szCs w:val="22"/>
-              </w:rPr>
-              <w:t>cessionario</w:t>
-            </w:r>
-            <w:proofErr w:type="gramEnd"/>
-            <w:r>
-              <w:rPr>
-                <w:rFonts w:ascii="Calibri" w:hAnsi="Calibri" w:cs="Calibri"/>
-                <w:color w:val="000000"/>
-                <w:sz w:val="22"/>
-                <w:szCs w:val="22"/>
-              </w:rPr>
-              <w:t>_razao_social</w:t>
-            </w:r>
-            <w:proofErr w:type="spellEnd"/>
-            <w:r>
-              <w:rPr>
-                <w:rFonts w:ascii="Calibri" w:hAnsi="Calibri" w:cs="Calibri"/>
-                <w:color w:val="000000"/>
-                <w:sz w:val="22"/>
-                <w:szCs w:val="22"/>
-              </w:rPr>
-              <w:t xml:space="preserve"> }}</w:t>
-            </w:r>
-          </w:p>
-        </w:tc>
-      </w:tr>
-      <w:tr>
-        <w:trPr>
-          <w:trHeight w:val="375"/>
-        </w:trPr>
-        <w:tc>
-          <w:tcPr>
-            <w:tcW w:w="2091" w:type="dxa"/>
+            <w:tcW w:w="2095" w:type="dxa"/>
             <w:tcBorders>
               <w:top w:val="nil"/>
               <w:left w:val="single" w:sz="4" w:space="0" w:color="auto"/>
@@ -6348,20 +6229,31 @@
                 <w:szCs w:val="22"/>
               </w:rPr>
             </w:pPr>
-            <w:r>
-              <w:rPr>
-                <w:rFonts w:ascii="Calibri" w:hAnsi="Calibri" w:cs="Calibri"/>
-                <w:color w:val="000000"/>
-                <w:sz w:val="22"/>
-                <w:szCs w:val="22"/>
-              </w:rPr>
-              <w:t>CNPJ/ME:</w:t>
-            </w:r>
-          </w:p>
-        </w:tc>
-        <w:tc>
-          <w:tcPr>
-            <w:tcW w:w="4037" w:type="dxa"/>
+            <w:proofErr w:type="spellStart"/>
+            <w:r>
+              <w:rPr>
+                <w:rFonts w:ascii="Calibri" w:hAnsi="Calibri" w:cs="Calibri"/>
+                <w:color w:val="000000"/>
+                <w:sz w:val="22"/>
+                <w:szCs w:val="22"/>
+              </w:rPr>
+              <w:t>Razão</w:t>
+            </w:r>
+            <w:proofErr w:type="spellEnd"/>
+            <w:r>
+              <w:rPr>
+                <w:rFonts w:ascii="Calibri" w:hAnsi="Calibri" w:cs="Calibri"/>
+                <w:color w:val="000000"/>
+                <w:sz w:val="22"/>
+                <w:szCs w:val="22"/>
+              </w:rPr>
+              <w:t xml:space="preserve"> Social:</w:t>
+            </w:r>
+          </w:p>
+        </w:tc>
+        <w:tc>
+          <w:tcPr>
+            <w:tcW w:w="4042" w:type="dxa"/>
             <w:tcBorders>
               <w:top w:val="nil"/>
               <w:left w:val="nil"/>
@@ -6408,7 +6300,7 @@
                 <w:sz w:val="22"/>
                 <w:szCs w:val="22"/>
               </w:rPr>
-              <w:t>_cnpj</w:t>
+              <w:t>_razao_social</w:t>
             </w:r>
             <w:proofErr w:type="spellEnd"/>
             <w:r>
@@ -6424,7 +6316,7 @@
         </w:tc>
         <w:tc>
           <w:tcPr>
-            <w:tcW w:w="3408" w:type="dxa"/>
+            <w:tcW w:w="3414" w:type="dxa"/>
             <w:tcBorders>
               <w:top w:val="nil"/>
               <w:left w:val="nil"/>
@@ -6458,11 +6350,11 @@
       </w:tr>
       <w:tr>
         <w:trPr>
-          <w:trHeight w:val="375"/>
+          <w:trHeight w:val="369"/>
         </w:trPr>
         <w:tc>
           <w:tcPr>
-            <w:tcW w:w="2091" w:type="dxa"/>
+            <w:tcW w:w="2095" w:type="dxa"/>
             <w:tcBorders>
               <w:top w:val="nil"/>
               <w:left w:val="single" w:sz="4" w:space="0" w:color="auto"/>
@@ -6482,6 +6374,48 @@
                 <w:szCs w:val="22"/>
               </w:rPr>
             </w:pPr>
+            <w:r>
+              <w:rPr>
+                <w:rFonts w:ascii="Calibri" w:hAnsi="Calibri" w:cs="Calibri"/>
+                <w:color w:val="000000"/>
+                <w:sz w:val="22"/>
+                <w:szCs w:val="22"/>
+              </w:rPr>
+              <w:t>CNPJ/ME:</w:t>
+            </w:r>
+          </w:p>
+        </w:tc>
+        <w:tc>
+          <w:tcPr>
+            <w:tcW w:w="4042" w:type="dxa"/>
+            <w:tcBorders>
+              <w:top w:val="nil"/>
+              <w:left w:val="nil"/>
+              <w:bottom w:val="nil"/>
+              <w:right w:val="nil"/>
+            </w:tcBorders>
+            <w:vAlign w:val="center"/>
+            <w:hideMark/>
+          </w:tcPr>
+          <w:p>
+            <w:pPr>
+              <w:rPr>
+                <w:rFonts w:ascii="Calibri" w:hAnsi="Calibri" w:cs="Calibri"/>
+                <w:color w:val="000000"/>
+                <w:sz w:val="22"/>
+                <w:szCs w:val="22"/>
+              </w:rPr>
+            </w:pPr>
+            <w:proofErr w:type="gramStart"/>
+            <w:r>
+              <w:rPr>
+                <w:rFonts w:ascii="Calibri" w:hAnsi="Calibri" w:cs="Calibri"/>
+                <w:color w:val="000000"/>
+                <w:sz w:val="22"/>
+                <w:szCs w:val="22"/>
+              </w:rPr>
+              <w:t xml:space="preserve">{{ </w:t>
+            </w:r>
             <w:proofErr w:type="spellStart"/>
             <w:r>
               <w:rPr>
@@ -6490,6 +6424,98 @@
                 <w:sz w:val="22"/>
                 <w:szCs w:val="22"/>
               </w:rPr>
+              <w:t>cessionario</w:t>
+            </w:r>
+            <w:proofErr w:type="gramEnd"/>
+            <w:r>
+              <w:rPr>
+                <w:rFonts w:ascii="Calibri" w:hAnsi="Calibri" w:cs="Calibri"/>
+                <w:color w:val="000000"/>
+                <w:sz w:val="22"/>
+                <w:szCs w:val="22"/>
+              </w:rPr>
+              <w:t>_cnpj</w:t>
+            </w:r>
+            <w:proofErr w:type="spellEnd"/>
+            <w:r>
+              <w:rPr>
+                <w:rFonts w:ascii="Calibri" w:hAnsi="Calibri" w:cs="Calibri"/>
+                <w:color w:val="000000"/>
+                <w:sz w:val="22"/>
+                <w:szCs w:val="22"/>
+              </w:rPr>
+              <w:t xml:space="preserve"> }}</w:t>
+            </w:r>
+          </w:p>
+        </w:tc>
+        <w:tc>
+          <w:tcPr>
+            <w:tcW w:w="3414" w:type="dxa"/>
+            <w:tcBorders>
+              <w:top w:val="nil"/>
+              <w:left w:val="nil"/>
+              <w:bottom w:val="nil"/>
+              <w:right w:val="single" w:sz="4" w:space="0" w:color="auto"/>
+            </w:tcBorders>
+            <w:noWrap/>
+            <w:vAlign w:val="bottom"/>
+            <w:hideMark/>
+          </w:tcPr>
+          <w:p>
+            <w:pPr>
+              <w:rPr>
+                <w:rFonts w:ascii="Calibri" w:hAnsi="Calibri" w:cs="Calibri"/>
+                <w:color w:val="000000"/>
+                <w:sz w:val="22"/>
+                <w:szCs w:val="22"/>
+              </w:rPr>
+            </w:pPr>
+            <w:r>
+              <w:rPr>
+                <w:rFonts w:ascii="Calibri" w:hAnsi="Calibri" w:cs="Calibri"/>
+                <w:color w:val="000000"/>
+                <w:sz w:val="22"/>
+                <w:szCs w:val="22"/>
+              </w:rPr>
+              <w:t> </w:t>
+            </w:r>
+          </w:p>
+        </w:tc>
+      </w:tr>
+      <w:tr>
+        <w:trPr>
+          <w:trHeight w:val="369"/>
+        </w:trPr>
+        <w:tc>
+          <w:tcPr>
+            <w:tcW w:w="2095" w:type="dxa"/>
+            <w:tcBorders>
+              <w:top w:val="nil"/>
+              <w:left w:val="single" w:sz="4" w:space="0" w:color="auto"/>
+              <w:bottom w:val="nil"/>
+              <w:right w:val="nil"/>
+            </w:tcBorders>
+            <w:noWrap/>
+            <w:vAlign w:val="bottom"/>
+            <w:hideMark/>
+          </w:tcPr>
+          <w:p>
+            <w:pPr>
+              <w:rPr>
+                <w:rFonts w:ascii="Calibri" w:hAnsi="Calibri" w:cs="Calibri"/>
+                <w:color w:val="000000"/>
+                <w:sz w:val="22"/>
+                <w:szCs w:val="22"/>
+              </w:rPr>
+            </w:pPr>
+            <w:proofErr w:type="spellStart"/>
+            <w:r>
+              <w:rPr>
+                <w:rFonts w:ascii="Calibri" w:hAnsi="Calibri" w:cs="Calibri"/>
+                <w:color w:val="000000"/>
+                <w:sz w:val="22"/>
+                <w:szCs w:val="22"/>
+              </w:rPr>
               <w:t>Representante</w:t>
             </w:r>
             <w:proofErr w:type="spellEnd"/>
@@ -6506,7 +6532,7 @@
         </w:tc>
         <w:tc>
           <w:tcPr>
-            <w:tcW w:w="4037" w:type="dxa"/>
+            <w:tcW w:w="4042" w:type="dxa"/>
             <w:tcBorders>
               <w:top w:val="nil"/>
               <w:left w:val="nil"/>
@@ -6570,7 +6596,7 @@
         </w:tc>
         <w:tc>
           <w:tcPr>
-            <w:tcW w:w="3408" w:type="dxa"/>
+            <w:tcW w:w="3414" w:type="dxa"/>
             <w:tcBorders>
               <w:top w:val="nil"/>
               <w:left w:val="nil"/>
@@ -6644,11 +6670,11 @@
       </w:tr>
       <w:tr>
         <w:trPr>
-          <w:trHeight w:val="375"/>
+          <w:trHeight w:val="369"/>
         </w:trPr>
         <w:tc>
           <w:tcPr>
-            <w:tcW w:w="2091" w:type="dxa"/>
+            <w:tcW w:w="2095" w:type="dxa"/>
             <w:tcBorders>
               <w:top w:val="nil"/>
               <w:left w:val="single" w:sz="4" w:space="0" w:color="auto"/>
@@ -6681,7 +6707,7 @@
         </w:tc>
         <w:tc>
           <w:tcPr>
-            <w:tcW w:w="4037" w:type="dxa"/>
+            <w:tcW w:w="4042" w:type="dxa"/>
             <w:tcBorders>
               <w:top w:val="nil"/>
               <w:left w:val="nil"/>
@@ -6745,7 +6771,7 @@
         </w:tc>
         <w:tc>
           <w:tcPr>
-            <w:tcW w:w="3408" w:type="dxa"/>
+            <w:tcW w:w="3414" w:type="dxa"/>
             <w:tcBorders>
               <w:top w:val="nil"/>
               <w:left w:val="nil"/>
@@ -6772,7 +6798,10 @@
                 <w:sz w:val="22"/>
                 <w:szCs w:val="22"/>
               </w:rPr>
-              <w:t xml:space="preserve">Cargo: </w:t>
+              <w:t>Cargo:</w:t>
+            </w:r>
+            <w:r>
+              <w:t xml:space="preserve"> </w:t>
             </w:r>
             <w:proofErr w:type="gramStart"/>
             <w:r>
@@ -6819,11 +6848,11 @@
       </w:tr>
       <w:tr>
         <w:trPr>
-          <w:trHeight w:val="375"/>
+          <w:trHeight w:val="369"/>
         </w:trPr>
         <w:tc>
           <w:tcPr>
-            <w:tcW w:w="2091" w:type="dxa"/>
+            <w:tcW w:w="2095" w:type="dxa"/>
             <w:tcBorders>
               <w:top w:val="nil"/>
               <w:left w:val="single" w:sz="4" w:space="0" w:color="auto"/>
@@ -6850,13 +6879,13 @@
                 <w:sz w:val="22"/>
                 <w:szCs w:val="22"/>
               </w:rPr>
-              <w:t>End.:</w:t>
-            </w:r>
-          </w:p>
-        </w:tc>
-        <w:tc>
-          <w:tcPr>
-            <w:tcW w:w="4037" w:type="dxa"/>
+              <w:t xml:space="preserve">End:  </w:t>
+            </w:r>
+          </w:p>
+        </w:tc>
+        <w:tc>
+          <w:tcPr>
+            <w:tcW w:w="4042" w:type="dxa"/>
             <w:tcBorders>
               <w:top w:val="nil"/>
               <w:left w:val="nil"/>
@@ -6920,7 +6949,7 @@
         </w:tc>
         <w:tc>
           <w:tcPr>
-            <w:tcW w:w="3408" w:type="dxa"/>
+            <w:tcW w:w="3414" w:type="dxa"/>
             <w:tcBorders>
               <w:top w:val="nil"/>
               <w:left w:val="nil"/>
@@ -6953,6 +6982,1146 @@
         </w:tc>
       </w:tr>
     </w:tbl>
+    <w:p>
+      <w:pPr>
+        <w:rPr>
+          <w:lang w:val="pt-BR"/>
+        </w:rPr>
+      </w:pPr>
+    </w:p>
+    <w:tbl>
+      <w:tblPr>
+        <w:tblW w:w="9552" w:type="dxa"/>
+        <w:tblCellMar>
+          <w:left w:w="70" w:type="dxa"/>
+          <w:right w:w="70" w:type="dxa"/>
+        </w:tblCellMar>
+        <w:tblLook w:val="04A0" w:firstRow="1" w:lastRow="0" w:firstColumn="1" w:lastColumn="0" w:noHBand="0" w:noVBand="1"/>
+      </w:tblPr>
+      <w:tblGrid>
+        <w:gridCol w:w="2095"/>
+        <w:gridCol w:w="4043"/>
+        <w:gridCol w:w="3414"/>
+      </w:tblGrid>
+      <w:tr>
+        <w:trPr>
+          <w:trHeight w:val="369"/>
+        </w:trPr>
+        <w:tc>
+          <w:tcPr>
+            <w:tcW w:w="6138" w:type="dxa"/>
+            <w:gridSpan w:val="2"/>
+            <w:tcBorders>
+              <w:top w:val="single" w:sz="4" w:space="0" w:color="auto"/>
+              <w:left w:val="single" w:sz="4" w:space="0" w:color="auto"/>
+              <w:bottom w:val="nil"/>
+              <w:right w:val="nil"/>
+            </w:tcBorders>
+            <w:noWrap/>
+            <w:vAlign w:val="bottom"/>
+            <w:hideMark/>
+          </w:tcPr>
+          <w:p>
+            <w:pPr>
+              <w:rPr>
+                <w:rFonts w:ascii="Calibri" w:hAnsi="Calibri" w:cs="Calibri"/>
+                <w:b/>
+                <w:bCs/>
+                <w:color w:val="000000"/>
+                <w:sz w:val="22"/>
+                <w:szCs w:val="22"/>
+                <w:lang w:val="pt-BR"/>
+              </w:rPr>
+            </w:pPr>
+            <w:r>
+              <w:rPr>
+                <w:rFonts w:ascii="Calibri" w:hAnsi="Calibri" w:cs="Calibri"/>
+                <w:b/>
+                <w:bCs/>
+                <w:color w:val="000000"/>
+                <w:sz w:val="22"/>
+                <w:szCs w:val="22"/>
+              </w:rPr>
+              <w:t>SACADO</w:t>
+            </w:r>
+          </w:p>
+        </w:tc>
+        <w:tc>
+          <w:tcPr>
+            <w:tcW w:w="3414" w:type="dxa"/>
+            <w:tcBorders>
+              <w:top w:val="single" w:sz="4" w:space="0" w:color="auto"/>
+              <w:left w:val="nil"/>
+              <w:bottom w:val="nil"/>
+              <w:right w:val="single" w:sz="4" w:space="0" w:color="auto"/>
+            </w:tcBorders>
+            <w:noWrap/>
+            <w:vAlign w:val="bottom"/>
+            <w:hideMark/>
+          </w:tcPr>
+          <w:p>
+            <w:pPr>
+              <w:rPr>
+                <w:rFonts w:ascii="Calibri" w:hAnsi="Calibri" w:cs="Calibri"/>
+                <w:b/>
+                <w:bCs/>
+                <w:color w:val="000000"/>
+                <w:sz w:val="22"/>
+                <w:szCs w:val="22"/>
+              </w:rPr>
+            </w:pPr>
+            <w:r>
+              <w:rPr>
+                <w:rFonts w:ascii="Calibri" w:hAnsi="Calibri" w:cs="Calibri"/>
+                <w:b/>
+                <w:bCs/>
+                <w:color w:val="000000"/>
+                <w:sz w:val="22"/>
+                <w:szCs w:val="22"/>
+              </w:rPr>
+              <w:t> </w:t>
+            </w:r>
+          </w:p>
+        </w:tc>
+      </w:tr>
+      <w:tr>
+        <w:trPr>
+          <w:trHeight w:val="369"/>
+        </w:trPr>
+        <w:tc>
+          <w:tcPr>
+            <w:tcW w:w="2095" w:type="dxa"/>
+            <w:tcBorders>
+              <w:top w:val="nil"/>
+              <w:left w:val="single" w:sz="4" w:space="0" w:color="auto"/>
+              <w:bottom w:val="nil"/>
+              <w:right w:val="nil"/>
+            </w:tcBorders>
+            <w:noWrap/>
+            <w:vAlign w:val="bottom"/>
+            <w:hideMark/>
+          </w:tcPr>
+          <w:p>
+            <w:pPr>
+              <w:jc w:val="center"/>
+              <w:rPr>
+                <w:rFonts w:ascii="Calibri" w:hAnsi="Calibri" w:cs="Calibri"/>
+                <w:b/>
+                <w:bCs/>
+                <w:color w:val="000000"/>
+                <w:sz w:val="22"/>
+                <w:szCs w:val="22"/>
+              </w:rPr>
+            </w:pPr>
+            <w:r>
+              <w:rPr>
+                <w:rFonts w:ascii="Calibri" w:hAnsi="Calibri" w:cs="Calibri"/>
+                <w:b/>
+                <w:bCs/>
+                <w:color w:val="000000"/>
+                <w:sz w:val="22"/>
+                <w:szCs w:val="22"/>
+              </w:rPr>
+              <w:t> </w:t>
+            </w:r>
+          </w:p>
+        </w:tc>
+        <w:tc>
+          <w:tcPr>
+            <w:tcW w:w="4042" w:type="dxa"/>
+            <w:tcBorders>
+              <w:top w:val="nil"/>
+              <w:left w:val="nil"/>
+              <w:bottom w:val="nil"/>
+              <w:right w:val="nil"/>
+            </w:tcBorders>
+            <w:noWrap/>
+            <w:vAlign w:val="bottom"/>
+            <w:hideMark/>
+          </w:tcPr>
+          <w:p>
+            <w:pPr>
+              <w:jc w:val="center"/>
+              <w:rPr>
+                <w:rFonts w:ascii="Calibri" w:hAnsi="Calibri" w:cs="Calibri"/>
+                <w:b/>
+                <w:bCs/>
+                <w:color w:val="000000"/>
+                <w:sz w:val="22"/>
+                <w:szCs w:val="22"/>
+              </w:rPr>
+            </w:pPr>
+          </w:p>
+        </w:tc>
+        <w:tc>
+          <w:tcPr>
+            <w:tcW w:w="3414" w:type="dxa"/>
+            <w:tcBorders>
+              <w:top w:val="nil"/>
+              <w:left w:val="nil"/>
+              <w:bottom w:val="nil"/>
+              <w:right w:val="single" w:sz="4" w:space="0" w:color="auto"/>
+            </w:tcBorders>
+            <w:noWrap/>
+            <w:vAlign w:val="bottom"/>
+            <w:hideMark/>
+          </w:tcPr>
+          <w:p>
+            <w:pPr>
+              <w:jc w:val="center"/>
+              <w:rPr>
+                <w:rFonts w:ascii="Calibri" w:hAnsi="Calibri" w:cs="Calibri"/>
+                <w:b/>
+                <w:bCs/>
+                <w:color w:val="000000"/>
+                <w:sz w:val="22"/>
+                <w:szCs w:val="22"/>
+              </w:rPr>
+            </w:pPr>
+            <w:r>
+              <w:rPr>
+                <w:rFonts w:ascii="Calibri" w:hAnsi="Calibri" w:cs="Calibri"/>
+                <w:b/>
+                <w:bCs/>
+                <w:color w:val="000000"/>
+                <w:sz w:val="22"/>
+                <w:szCs w:val="22"/>
+              </w:rPr>
+              <w:t> </w:t>
+            </w:r>
+          </w:p>
+        </w:tc>
+      </w:tr>
+      <w:tr>
+        <w:trPr>
+          <w:trHeight w:val="369"/>
+        </w:trPr>
+        <w:tc>
+          <w:tcPr>
+            <w:tcW w:w="9552" w:type="dxa"/>
+            <w:gridSpan w:val="3"/>
+            <w:tcBorders>
+              <w:top w:val="nil"/>
+              <w:left w:val="single" w:sz="4" w:space="0" w:color="auto"/>
+              <w:bottom w:val="nil"/>
+              <w:right w:val="single" w:sz="4" w:space="0" w:color="000000"/>
+            </w:tcBorders>
+            <w:noWrap/>
+            <w:vAlign w:val="bottom"/>
+            <w:hideMark/>
+          </w:tcPr>
+          <w:p>
+            <w:pPr>
+              <w:jc w:val="center"/>
+              <w:rPr>
+                <w:rFonts w:ascii="Calibri" w:hAnsi="Calibri" w:cs="Calibri"/>
+                <w:color w:val="000000"/>
+                <w:sz w:val="22"/>
+                <w:szCs w:val="22"/>
+              </w:rPr>
+            </w:pPr>
+            <w:r>
+              <w:rPr>
+                <w:rFonts w:ascii="Calibri" w:hAnsi="Calibri" w:cs="Calibri"/>
+                <w:color w:val="000000"/>
+                <w:sz w:val="22"/>
+                <w:szCs w:val="22"/>
+              </w:rPr>
+              <w:t>__________________________________________________________</w:t>
+            </w:r>
+          </w:p>
+        </w:tc>
+      </w:tr>
+      <w:tr>
+        <w:trPr>
+          <w:trHeight w:val="369"/>
+        </w:trPr>
+        <w:tc>
+          <w:tcPr>
+            <w:tcW w:w="9552" w:type="dxa"/>
+            <w:gridSpan w:val="3"/>
+            <w:tcBorders>
+              <w:top w:val="nil"/>
+              <w:left w:val="single" w:sz="4" w:space="0" w:color="auto"/>
+              <w:bottom w:val="nil"/>
+              <w:right w:val="single" w:sz="4" w:space="0" w:color="000000"/>
+            </w:tcBorders>
+            <w:noWrap/>
+            <w:vAlign w:val="bottom"/>
+            <w:hideMark/>
+          </w:tcPr>
+          <w:p>
+            <w:pPr>
+              <w:jc w:val="center"/>
+              <w:rPr>
+                <w:rFonts w:ascii="Calibri" w:hAnsi="Calibri" w:cs="Calibri"/>
+                <w:color w:val="000000"/>
+                <w:sz w:val="22"/>
+                <w:szCs w:val="22"/>
+              </w:rPr>
+            </w:pPr>
+            <w:r>
+              <w:rPr>
+                <w:rFonts w:ascii="Calibri" w:hAnsi="Calibri" w:cs="Calibri"/>
+                <w:color w:val="000000"/>
+                <w:sz w:val="22"/>
+                <w:szCs w:val="22"/>
+              </w:rPr>
+              <w:t>(</w:t>
+            </w:r>
+            <w:proofErr w:type="spellStart"/>
+            <w:r>
+              <w:rPr>
+                <w:rFonts w:ascii="Calibri" w:hAnsi="Calibri" w:cs="Calibri"/>
+                <w:color w:val="000000"/>
+                <w:sz w:val="22"/>
+                <w:szCs w:val="22"/>
+              </w:rPr>
+              <w:t>assinatura</w:t>
+            </w:r>
+            <w:proofErr w:type="spellEnd"/>
+            <w:r>
+              <w:rPr>
+                <w:rFonts w:ascii="Calibri" w:hAnsi="Calibri" w:cs="Calibri"/>
+                <w:color w:val="000000"/>
+                <w:sz w:val="22"/>
+                <w:szCs w:val="22"/>
+              </w:rPr>
+              <w:t>)</w:t>
+            </w:r>
+          </w:p>
+        </w:tc>
+      </w:tr>
+      <w:tr>
+        <w:trPr>
+          <w:trHeight w:val="369"/>
+        </w:trPr>
+        <w:tc>
+          <w:tcPr>
+            <w:tcW w:w="9552" w:type="dxa"/>
+            <w:gridSpan w:val="3"/>
+            <w:tcBorders>
+              <w:top w:val="nil"/>
+              <w:left w:val="single" w:sz="4" w:space="0" w:color="auto"/>
+              <w:bottom w:val="nil"/>
+              <w:right w:val="single" w:sz="4" w:space="0" w:color="000000"/>
+            </w:tcBorders>
+            <w:noWrap/>
+            <w:vAlign w:val="bottom"/>
+            <w:hideMark/>
+          </w:tcPr>
+          <w:p>
+            <w:pPr>
+              <w:jc w:val="center"/>
+              <w:rPr>
+                <w:rFonts w:ascii="Calibri" w:hAnsi="Calibri" w:cs="Calibri"/>
+                <w:color w:val="000000"/>
+                <w:sz w:val="22"/>
+                <w:szCs w:val="22"/>
+              </w:rPr>
+            </w:pPr>
+            <w:r>
+              <w:rPr>
+                <w:rFonts w:ascii="Calibri" w:hAnsi="Calibri" w:cs="Calibri"/>
+                <w:color w:val="000000"/>
+                <w:sz w:val="22"/>
+                <w:szCs w:val="22"/>
+              </w:rPr>
+              <w:t> </w:t>
+            </w:r>
+          </w:p>
+        </w:tc>
+      </w:tr>
+      <w:tr>
+        <w:trPr>
+          <w:trHeight w:val="369"/>
+        </w:trPr>
+        <w:tc>
+          <w:tcPr>
+            <w:tcW w:w="2095" w:type="dxa"/>
+            <w:tcBorders>
+              <w:top w:val="nil"/>
+              <w:left w:val="single" w:sz="4" w:space="0" w:color="auto"/>
+              <w:bottom w:val="nil"/>
+              <w:right w:val="nil"/>
+            </w:tcBorders>
+            <w:noWrap/>
+            <w:vAlign w:val="bottom"/>
+            <w:hideMark/>
+          </w:tcPr>
+          <w:p>
+            <w:pPr>
+              <w:rPr>
+                <w:rFonts w:ascii="Calibri" w:hAnsi="Calibri" w:cs="Calibri"/>
+                <w:color w:val="000000"/>
+                <w:sz w:val="22"/>
+                <w:szCs w:val="22"/>
+              </w:rPr>
+            </w:pPr>
+            <w:proofErr w:type="spellStart"/>
+            <w:r>
+              <w:rPr>
+                <w:rFonts w:ascii="Calibri" w:hAnsi="Calibri" w:cs="Calibri"/>
+                <w:color w:val="000000"/>
+                <w:sz w:val="22"/>
+                <w:szCs w:val="22"/>
+              </w:rPr>
+              <w:t>Razão</w:t>
+            </w:r>
+            <w:proofErr w:type="spellEnd"/>
+            <w:r>
+              <w:rPr>
+                <w:rFonts w:ascii="Calibri" w:hAnsi="Calibri" w:cs="Calibri"/>
+                <w:color w:val="000000"/>
+                <w:sz w:val="22"/>
+                <w:szCs w:val="22"/>
+              </w:rPr>
+              <w:t xml:space="preserve"> Social:</w:t>
+            </w:r>
+          </w:p>
+        </w:tc>
+        <w:tc>
+          <w:tcPr>
+            <w:tcW w:w="4042" w:type="dxa"/>
+            <w:tcBorders>
+              <w:top w:val="nil"/>
+              <w:left w:val="nil"/>
+              <w:bottom w:val="nil"/>
+              <w:right w:val="nil"/>
+            </w:tcBorders>
+            <w:vAlign w:val="center"/>
+            <w:hideMark/>
+          </w:tcPr>
+          <w:p>
+            <w:pPr>
+              <w:rPr>
+                <w:rFonts w:ascii="Calibri" w:hAnsi="Calibri" w:cs="Calibri"/>
+                <w:color w:val="000000"/>
+                <w:sz w:val="22"/>
+                <w:szCs w:val="22"/>
+              </w:rPr>
+            </w:pPr>
+            <w:proofErr w:type="gramStart"/>
+            <w:r>
+              <w:rPr>
+                <w:rFonts w:ascii="Calibri" w:hAnsi="Calibri" w:cs="Calibri"/>
+                <w:color w:val="000000"/>
+                <w:sz w:val="22"/>
+                <w:szCs w:val="22"/>
+              </w:rPr>
+              <w:t xml:space="preserve">{{ </w:t>
+            </w:r>
+            <w:proofErr w:type="spellStart"/>
+            <w:r>
+              <w:rPr>
+                <w:rFonts w:ascii="Calibri" w:hAnsi="Calibri" w:cs="Calibri"/>
+                <w:color w:val="000000"/>
+                <w:sz w:val="22"/>
+                <w:szCs w:val="22"/>
+              </w:rPr>
+              <w:t>sacado</w:t>
+            </w:r>
+            <w:proofErr w:type="gramEnd"/>
+            <w:r>
+              <w:rPr>
+                <w:rFonts w:ascii="Calibri" w:hAnsi="Calibri" w:cs="Calibri"/>
+                <w:color w:val="000000"/>
+                <w:sz w:val="22"/>
+                <w:szCs w:val="22"/>
+              </w:rPr>
+              <w:t>_razao_social</w:t>
+            </w:r>
+            <w:proofErr w:type="spellEnd"/>
+            <w:r>
+              <w:rPr>
+                <w:rFonts w:ascii="Calibri" w:hAnsi="Calibri" w:cs="Calibri"/>
+                <w:color w:val="000000"/>
+                <w:sz w:val="22"/>
+                <w:szCs w:val="22"/>
+              </w:rPr>
+              <w:t xml:space="preserve"> }}</w:t>
+            </w:r>
+          </w:p>
+        </w:tc>
+        <w:tc>
+          <w:tcPr>
+            <w:tcW w:w="3414" w:type="dxa"/>
+            <w:tcBorders>
+              <w:top w:val="nil"/>
+              <w:left w:val="nil"/>
+              <w:bottom w:val="nil"/>
+              <w:right w:val="single" w:sz="4" w:space="0" w:color="auto"/>
+            </w:tcBorders>
+            <w:noWrap/>
+            <w:vAlign w:val="bottom"/>
+            <w:hideMark/>
+          </w:tcPr>
+          <w:p>
+            <w:pPr>
+              <w:rPr>
+                <w:rFonts w:ascii="Calibri" w:hAnsi="Calibri" w:cs="Calibri"/>
+                <w:color w:val="000000"/>
+                <w:sz w:val="22"/>
+                <w:szCs w:val="22"/>
+              </w:rPr>
+            </w:pPr>
+            <w:r>
+              <w:rPr>
+                <w:rFonts w:ascii="Calibri" w:hAnsi="Calibri" w:cs="Calibri"/>
+                <w:color w:val="000000"/>
+                <w:sz w:val="22"/>
+                <w:szCs w:val="22"/>
+              </w:rPr>
+              <w:t> </w:t>
+            </w:r>
+          </w:p>
+        </w:tc>
+      </w:tr>
+      <w:tr>
+        <w:trPr>
+          <w:trHeight w:val="369"/>
+        </w:trPr>
+        <w:tc>
+          <w:tcPr>
+            <w:tcW w:w="2095" w:type="dxa"/>
+            <w:tcBorders>
+              <w:top w:val="nil"/>
+              <w:left w:val="single" w:sz="4" w:space="0" w:color="auto"/>
+              <w:bottom w:val="nil"/>
+              <w:right w:val="nil"/>
+            </w:tcBorders>
+            <w:noWrap/>
+            <w:vAlign w:val="bottom"/>
+            <w:hideMark/>
+          </w:tcPr>
+          <w:p>
+            <w:pPr>
+              <w:rPr>
+                <w:rFonts w:ascii="Calibri" w:hAnsi="Calibri" w:cs="Calibri"/>
+                <w:color w:val="000000"/>
+                <w:sz w:val="22"/>
+                <w:szCs w:val="22"/>
+              </w:rPr>
+            </w:pPr>
+            <w:r>
+              <w:rPr>
+                <w:rFonts w:ascii="Calibri" w:hAnsi="Calibri" w:cs="Calibri"/>
+                <w:color w:val="000000"/>
+                <w:sz w:val="22"/>
+                <w:szCs w:val="22"/>
+              </w:rPr>
+              <w:t>CNPJ/ME:</w:t>
+            </w:r>
+          </w:p>
+        </w:tc>
+        <w:tc>
+          <w:tcPr>
+            <w:tcW w:w="4042" w:type="dxa"/>
+            <w:tcBorders>
+              <w:top w:val="nil"/>
+              <w:left w:val="nil"/>
+              <w:bottom w:val="nil"/>
+              <w:right w:val="nil"/>
+            </w:tcBorders>
+            <w:vAlign w:val="center"/>
+            <w:hideMark/>
+          </w:tcPr>
+          <w:p>
+            <w:pPr>
+              <w:rPr>
+                <w:rFonts w:ascii="Calibri" w:hAnsi="Calibri" w:cs="Calibri"/>
+                <w:color w:val="000000"/>
+                <w:sz w:val="22"/>
+                <w:szCs w:val="22"/>
+              </w:rPr>
+            </w:pPr>
+            <w:proofErr w:type="gramStart"/>
+            <w:r>
+              <w:rPr>
+                <w:rFonts w:ascii="Calibri" w:hAnsi="Calibri" w:cs="Calibri"/>
+                <w:color w:val="000000"/>
+                <w:sz w:val="22"/>
+                <w:szCs w:val="22"/>
+              </w:rPr>
+              <w:t xml:space="preserve">{{ </w:t>
+            </w:r>
+            <w:proofErr w:type="spellStart"/>
+            <w:r>
+              <w:rPr>
+                <w:rFonts w:ascii="Calibri" w:hAnsi="Calibri" w:cs="Calibri"/>
+                <w:color w:val="000000"/>
+                <w:sz w:val="22"/>
+                <w:szCs w:val="22"/>
+              </w:rPr>
+              <w:t>sacado</w:t>
+            </w:r>
+            <w:proofErr w:type="gramEnd"/>
+            <w:r>
+              <w:rPr>
+                <w:rFonts w:ascii="Calibri" w:hAnsi="Calibri" w:cs="Calibri"/>
+                <w:color w:val="000000"/>
+                <w:sz w:val="22"/>
+                <w:szCs w:val="22"/>
+              </w:rPr>
+              <w:t>_cnpj</w:t>
+            </w:r>
+            <w:proofErr w:type="spellEnd"/>
+            <w:r>
+              <w:rPr>
+                <w:rFonts w:ascii="Calibri" w:hAnsi="Calibri" w:cs="Calibri"/>
+                <w:color w:val="000000"/>
+                <w:sz w:val="22"/>
+                <w:szCs w:val="22"/>
+              </w:rPr>
+              <w:t xml:space="preserve"> }}</w:t>
+            </w:r>
+          </w:p>
+        </w:tc>
+        <w:tc>
+          <w:tcPr>
+            <w:tcW w:w="3414" w:type="dxa"/>
+            <w:tcBorders>
+              <w:top w:val="nil"/>
+              <w:left w:val="nil"/>
+              <w:bottom w:val="nil"/>
+              <w:right w:val="single" w:sz="4" w:space="0" w:color="auto"/>
+            </w:tcBorders>
+            <w:noWrap/>
+            <w:vAlign w:val="bottom"/>
+            <w:hideMark/>
+          </w:tcPr>
+          <w:p>
+            <w:pPr>
+              <w:rPr>
+                <w:rFonts w:ascii="Calibri" w:hAnsi="Calibri" w:cs="Calibri"/>
+                <w:color w:val="000000"/>
+                <w:sz w:val="22"/>
+                <w:szCs w:val="22"/>
+              </w:rPr>
+            </w:pPr>
+            <w:r>
+              <w:rPr>
+                <w:rFonts w:ascii="Calibri" w:hAnsi="Calibri" w:cs="Calibri"/>
+                <w:color w:val="000000"/>
+                <w:sz w:val="22"/>
+                <w:szCs w:val="22"/>
+              </w:rPr>
+              <w:t> </w:t>
+            </w:r>
+          </w:p>
+        </w:tc>
+      </w:tr>
+      <w:tr>
+        <w:trPr>
+          <w:trHeight w:val="369"/>
+        </w:trPr>
+        <w:tc>
+          <w:tcPr>
+            <w:tcW w:w="2095" w:type="dxa"/>
+            <w:tcBorders>
+              <w:top w:val="nil"/>
+              <w:left w:val="single" w:sz="4" w:space="0" w:color="auto"/>
+              <w:bottom w:val="nil"/>
+              <w:right w:val="nil"/>
+            </w:tcBorders>
+            <w:noWrap/>
+            <w:vAlign w:val="bottom"/>
+            <w:hideMark/>
+          </w:tcPr>
+          <w:p>
+            <w:pPr>
+              <w:rPr>
+                <w:rFonts w:ascii="Calibri" w:hAnsi="Calibri" w:cs="Calibri"/>
+                <w:color w:val="000000"/>
+                <w:sz w:val="22"/>
+                <w:szCs w:val="22"/>
+              </w:rPr>
+            </w:pPr>
+            <w:proofErr w:type="spellStart"/>
+            <w:r>
+              <w:rPr>
+                <w:rFonts w:ascii="Calibri" w:hAnsi="Calibri" w:cs="Calibri"/>
+                <w:color w:val="000000"/>
+                <w:sz w:val="22"/>
+                <w:szCs w:val="22"/>
+              </w:rPr>
+              <w:t>Representante</w:t>
+            </w:r>
+            <w:proofErr w:type="spellEnd"/>
+            <w:r>
+              <w:rPr>
+                <w:rFonts w:ascii="Calibri" w:hAnsi="Calibri" w:cs="Calibri"/>
+                <w:color w:val="000000"/>
+                <w:sz w:val="22"/>
+                <w:szCs w:val="22"/>
+              </w:rPr>
+              <w:t>:</w:t>
+            </w:r>
+          </w:p>
+        </w:tc>
+        <w:tc>
+          <w:tcPr>
+            <w:tcW w:w="4042" w:type="dxa"/>
+            <w:tcBorders>
+              <w:top w:val="nil"/>
+              <w:left w:val="nil"/>
+              <w:bottom w:val="nil"/>
+              <w:right w:val="nil"/>
+            </w:tcBorders>
+            <w:noWrap/>
+            <w:vAlign w:val="bottom"/>
+            <w:hideMark/>
+          </w:tcPr>
+          <w:p>
+            <w:pPr>
+              <w:rPr>
+                <w:rFonts w:ascii="Calibri" w:hAnsi="Calibri" w:cs="Calibri"/>
+                <w:color w:val="000000"/>
+                <w:sz w:val="22"/>
+                <w:szCs w:val="22"/>
+              </w:rPr>
+            </w:pPr>
+            <w:proofErr w:type="gramStart"/>
+            <w:r>
+              <w:rPr>
+                <w:rFonts w:ascii="Calibri" w:hAnsi="Calibri" w:cs="Calibri"/>
+                <w:color w:val="000000"/>
+                <w:sz w:val="22"/>
+                <w:szCs w:val="22"/>
+              </w:rPr>
+              <w:t xml:space="preserve">{{ </w:t>
+            </w:r>
+            <w:proofErr w:type="spellStart"/>
+            <w:r>
+              <w:rPr>
+                <w:rFonts w:ascii="Calibri" w:hAnsi="Calibri" w:cs="Calibri"/>
+                <w:color w:val="000000"/>
+                <w:sz w:val="22"/>
+                <w:szCs w:val="22"/>
+              </w:rPr>
+              <w:t>sacado</w:t>
+            </w:r>
+            <w:proofErr w:type="gramEnd"/>
+            <w:r>
+              <w:rPr>
+                <w:rFonts w:ascii="Calibri" w:hAnsi="Calibri" w:cs="Calibri"/>
+                <w:color w:val="000000"/>
+                <w:sz w:val="22"/>
+                <w:szCs w:val="22"/>
+              </w:rPr>
+              <w:t>_representante</w:t>
+            </w:r>
+            <w:proofErr w:type="spellEnd"/>
+            <w:r>
+              <w:rPr>
+                <w:rFonts w:ascii="Calibri" w:hAnsi="Calibri" w:cs="Calibri"/>
+                <w:color w:val="000000"/>
+                <w:sz w:val="22"/>
+                <w:szCs w:val="22"/>
+              </w:rPr>
+              <w:t xml:space="preserve"> }}</w:t>
+            </w:r>
+          </w:p>
+        </w:tc>
+        <w:tc>
+          <w:tcPr>
+            <w:tcW w:w="3414" w:type="dxa"/>
+            <w:tcBorders>
+              <w:top w:val="nil"/>
+              <w:left w:val="nil"/>
+              <w:bottom w:val="nil"/>
+              <w:right w:val="single" w:sz="4" w:space="0" w:color="auto"/>
+            </w:tcBorders>
+            <w:noWrap/>
+            <w:vAlign w:val="bottom"/>
+            <w:hideMark/>
+          </w:tcPr>
+          <w:p>
+            <w:pPr>
+              <w:rPr>
+                <w:rFonts w:ascii="Calibri" w:hAnsi="Calibri" w:cs="Calibri"/>
+                <w:color w:val="000000"/>
+                <w:sz w:val="22"/>
+                <w:szCs w:val="22"/>
+              </w:rPr>
+            </w:pPr>
+            <w:r>
+              <w:rPr>
+                <w:rFonts w:ascii="Calibri" w:hAnsi="Calibri" w:cs="Calibri"/>
+                <w:color w:val="000000"/>
+                <w:sz w:val="22"/>
+                <w:szCs w:val="22"/>
+              </w:rPr>
+              <w:t xml:space="preserve">E-mail: </w:t>
+            </w:r>
+            <w:proofErr w:type="gramStart"/>
+            <w:r>
+              <w:rPr>
+                <w:rFonts w:ascii="Calibri" w:hAnsi="Calibri" w:cs="Calibri"/>
+                <w:color w:val="000000"/>
+                <w:sz w:val="22"/>
+                <w:szCs w:val="22"/>
+              </w:rPr>
+              <w:t xml:space="preserve">{{ </w:t>
+            </w:r>
+            <w:proofErr w:type="spellStart"/>
+            <w:r>
+              <w:rPr>
+                <w:rFonts w:ascii="Calibri" w:hAnsi="Calibri" w:cs="Calibri"/>
+                <w:color w:val="000000"/>
+                <w:sz w:val="22"/>
+                <w:szCs w:val="22"/>
+              </w:rPr>
+              <w:t>sacado</w:t>
+            </w:r>
+            <w:proofErr w:type="gramEnd"/>
+            <w:r>
+              <w:rPr>
+                <w:rFonts w:ascii="Calibri" w:hAnsi="Calibri" w:cs="Calibri"/>
+                <w:color w:val="000000"/>
+                <w:sz w:val="22"/>
+                <w:szCs w:val="22"/>
+              </w:rPr>
+              <w:t>_email</w:t>
+            </w:r>
+            <w:proofErr w:type="spellEnd"/>
+            <w:r>
+              <w:rPr>
+                <w:rFonts w:ascii="Calibri" w:hAnsi="Calibri" w:cs="Calibri"/>
+                <w:color w:val="000000"/>
+                <w:sz w:val="22"/>
+                <w:szCs w:val="22"/>
+              </w:rPr>
+              <w:t xml:space="preserve"> }}</w:t>
+            </w:r>
+          </w:p>
+        </w:tc>
+      </w:tr>
+      <w:tr>
+        <w:trPr>
+          <w:trHeight w:val="369"/>
+        </w:trPr>
+        <w:tc>
+          <w:tcPr>
+            <w:tcW w:w="2095" w:type="dxa"/>
+            <w:tcBorders>
+              <w:top w:val="nil"/>
+              <w:left w:val="single" w:sz="4" w:space="0" w:color="auto"/>
+              <w:bottom w:val="nil"/>
+              <w:right w:val="nil"/>
+            </w:tcBorders>
+            <w:noWrap/>
+            <w:vAlign w:val="bottom"/>
+            <w:hideMark/>
+          </w:tcPr>
+          <w:p>
+            <w:pPr>
+              <w:rPr>
+                <w:rFonts w:ascii="Calibri" w:hAnsi="Calibri" w:cs="Calibri"/>
+                <w:color w:val="000000"/>
+                <w:sz w:val="22"/>
+                <w:szCs w:val="22"/>
+              </w:rPr>
+            </w:pPr>
+            <w:r>
+              <w:rPr>
+                <w:rFonts w:ascii="Calibri" w:hAnsi="Calibri" w:cs="Calibri"/>
+                <w:color w:val="000000"/>
+                <w:sz w:val="22"/>
+                <w:szCs w:val="22"/>
+              </w:rPr>
+              <w:t>CPF/ME:</w:t>
+            </w:r>
+          </w:p>
+        </w:tc>
+        <w:tc>
+          <w:tcPr>
+            <w:tcW w:w="4042" w:type="dxa"/>
+            <w:tcBorders>
+              <w:top w:val="nil"/>
+              <w:left w:val="nil"/>
+              <w:bottom w:val="nil"/>
+              <w:right w:val="nil"/>
+            </w:tcBorders>
+            <w:noWrap/>
+            <w:vAlign w:val="bottom"/>
+            <w:hideMark/>
+          </w:tcPr>
+          <w:p>
+            <w:pPr>
+              <w:rPr>
+                <w:rFonts w:ascii="Calibri" w:hAnsi="Calibri" w:cs="Calibri"/>
+                <w:color w:val="000000"/>
+                <w:sz w:val="22"/>
+                <w:szCs w:val="22"/>
+              </w:rPr>
+            </w:pPr>
+            <w:proofErr w:type="gramStart"/>
+            <w:r>
+              <w:rPr>
+                <w:rFonts w:ascii="Calibri" w:hAnsi="Calibri" w:cs="Calibri"/>
+                <w:color w:val="000000"/>
+                <w:sz w:val="22"/>
+                <w:szCs w:val="22"/>
+              </w:rPr>
+              <w:t xml:space="preserve">{{ </w:t>
+            </w:r>
+            <w:proofErr w:type="spellStart"/>
+            <w:r>
+              <w:rPr>
+                <w:rFonts w:ascii="Calibri" w:hAnsi="Calibri" w:cs="Calibri"/>
+                <w:color w:val="000000"/>
+                <w:sz w:val="22"/>
+                <w:szCs w:val="22"/>
+              </w:rPr>
+              <w:t>sacado</w:t>
+            </w:r>
+            <w:proofErr w:type="gramEnd"/>
+            <w:r>
+              <w:rPr>
+                <w:rFonts w:ascii="Calibri" w:hAnsi="Calibri" w:cs="Calibri"/>
+                <w:color w:val="000000"/>
+                <w:sz w:val="22"/>
+                <w:szCs w:val="22"/>
+              </w:rPr>
+              <w:t>_cpf</w:t>
+            </w:r>
+            <w:proofErr w:type="spellEnd"/>
+            <w:r>
+              <w:rPr>
+                <w:rFonts w:ascii="Calibri" w:hAnsi="Calibri" w:cs="Calibri"/>
+                <w:color w:val="000000"/>
+                <w:sz w:val="22"/>
+                <w:szCs w:val="22"/>
+              </w:rPr>
+              <w:t xml:space="preserve"> }}</w:t>
+            </w:r>
+          </w:p>
+        </w:tc>
+        <w:tc>
+          <w:tcPr>
+            <w:tcW w:w="3414" w:type="dxa"/>
+            <w:tcBorders>
+              <w:top w:val="nil"/>
+              <w:left w:val="nil"/>
+              <w:bottom w:val="nil"/>
+              <w:right w:val="single" w:sz="4" w:space="0" w:color="auto"/>
+            </w:tcBorders>
+            <w:noWrap/>
+            <w:vAlign w:val="bottom"/>
+            <w:hideMark/>
+          </w:tcPr>
+          <w:p>
+            <w:pPr>
+              <w:rPr>
+                <w:rFonts w:ascii="Calibri" w:hAnsi="Calibri" w:cs="Calibri"/>
+                <w:color w:val="000000"/>
+                <w:sz w:val="22"/>
+                <w:szCs w:val="22"/>
+              </w:rPr>
+            </w:pPr>
+            <w:r>
+              <w:rPr>
+                <w:rFonts w:ascii="Calibri" w:hAnsi="Calibri" w:cs="Calibri"/>
+                <w:color w:val="000000"/>
+                <w:sz w:val="22"/>
+                <w:szCs w:val="22"/>
+              </w:rPr>
+              <w:t>Cargo:</w:t>
+            </w:r>
+            <w:r>
+              <w:t xml:space="preserve"> </w:t>
+            </w:r>
+            <w:proofErr w:type="gramStart"/>
+            <w:r>
+              <w:rPr>
+                <w:rFonts w:ascii="Calibri" w:hAnsi="Calibri" w:cs="Calibri"/>
+                <w:color w:val="000000"/>
+                <w:sz w:val="22"/>
+                <w:szCs w:val="22"/>
+              </w:rPr>
+              <w:t xml:space="preserve">{{ </w:t>
+            </w:r>
+            <w:proofErr w:type="spellStart"/>
+            <w:r>
+              <w:rPr>
+                <w:rFonts w:ascii="Calibri" w:hAnsi="Calibri" w:cs="Calibri"/>
+                <w:color w:val="000000"/>
+                <w:sz w:val="22"/>
+                <w:szCs w:val="22"/>
+              </w:rPr>
+              <w:t>sacado</w:t>
+            </w:r>
+            <w:proofErr w:type="gramEnd"/>
+            <w:r>
+              <w:rPr>
+                <w:rFonts w:ascii="Calibri" w:hAnsi="Calibri" w:cs="Calibri"/>
+                <w:color w:val="000000"/>
+                <w:sz w:val="22"/>
+                <w:szCs w:val="22"/>
+              </w:rPr>
+              <w:t>_cargo</w:t>
+            </w:r>
+            <w:proofErr w:type="spellEnd"/>
+            <w:r>
+              <w:rPr>
+                <w:rFonts w:ascii="Calibri" w:hAnsi="Calibri" w:cs="Calibri"/>
+                <w:color w:val="000000"/>
+                <w:sz w:val="22"/>
+                <w:szCs w:val="22"/>
+              </w:rPr>
+              <w:t xml:space="preserve"> }}</w:t>
+            </w:r>
+          </w:p>
+        </w:tc>
+      </w:tr>
+      <w:tr>
+        <w:trPr>
+          <w:trHeight w:val="369"/>
+        </w:trPr>
+        <w:tc>
+          <w:tcPr>
+            <w:tcW w:w="2095" w:type="dxa"/>
+            <w:tcBorders>
+              <w:top w:val="nil"/>
+              <w:left w:val="single" w:sz="4" w:space="0" w:color="auto"/>
+              <w:bottom w:val="single" w:sz="4" w:space="0" w:color="auto"/>
+              <w:right w:val="nil"/>
+            </w:tcBorders>
+            <w:noWrap/>
+            <w:vAlign w:val="bottom"/>
+            <w:hideMark/>
+          </w:tcPr>
+          <w:p>
+            <w:pPr>
+              <w:rPr>
+                <w:rFonts w:ascii="Calibri" w:hAnsi="Calibri" w:cs="Calibri"/>
+                <w:color w:val="000000"/>
+                <w:sz w:val="22"/>
+                <w:szCs w:val="22"/>
+              </w:rPr>
+            </w:pPr>
+            <w:r>
+              <w:rPr>
+                <w:rFonts w:ascii="Calibri" w:hAnsi="Calibri" w:cs="Calibri"/>
+                <w:color w:val="000000"/>
+                <w:sz w:val="22"/>
+                <w:szCs w:val="22"/>
+              </w:rPr>
+              <w:t xml:space="preserve">End:  </w:t>
+            </w:r>
+          </w:p>
+        </w:tc>
+        <w:tc>
+          <w:tcPr>
+            <w:tcW w:w="4042" w:type="dxa"/>
+            <w:tcBorders>
+              <w:top w:val="nil"/>
+              <w:left w:val="nil"/>
+              <w:bottom w:val="single" w:sz="4" w:space="0" w:color="auto"/>
+              <w:right w:val="nil"/>
+            </w:tcBorders>
+            <w:noWrap/>
+            <w:vAlign w:val="bottom"/>
+            <w:hideMark/>
+          </w:tcPr>
+          <w:p>
+            <w:pPr>
+              <w:rPr>
+                <w:rFonts w:ascii="Calibri" w:hAnsi="Calibri" w:cs="Calibri"/>
+                <w:color w:val="000000"/>
+                <w:sz w:val="22"/>
+                <w:szCs w:val="22"/>
+              </w:rPr>
+            </w:pPr>
+            <w:proofErr w:type="gramStart"/>
+            <w:r>
+              <w:rPr>
+                <w:rFonts w:ascii="Calibri" w:hAnsi="Calibri" w:cs="Calibri"/>
+                <w:color w:val="000000"/>
+                <w:sz w:val="22"/>
+                <w:szCs w:val="22"/>
+              </w:rPr>
+              <w:t xml:space="preserve">{{ </w:t>
+            </w:r>
+            <w:proofErr w:type="spellStart"/>
+            <w:r>
+              <w:rPr>
+                <w:rFonts w:ascii="Calibri" w:hAnsi="Calibri" w:cs="Calibri"/>
+                <w:color w:val="000000"/>
+                <w:sz w:val="22"/>
+                <w:szCs w:val="22"/>
+              </w:rPr>
+              <w:t>sacado</w:t>
+            </w:r>
+            <w:proofErr w:type="gramEnd"/>
+            <w:r>
+              <w:rPr>
+                <w:rFonts w:ascii="Calibri" w:hAnsi="Calibri" w:cs="Calibri"/>
+                <w:color w:val="000000"/>
+                <w:sz w:val="22"/>
+                <w:szCs w:val="22"/>
+              </w:rPr>
+              <w:t>_endereco</w:t>
+            </w:r>
+            <w:proofErr w:type="spellEnd"/>
+            <w:r>
+              <w:rPr>
+                <w:rFonts w:ascii="Calibri" w:hAnsi="Calibri" w:cs="Calibri"/>
+                <w:color w:val="000000"/>
+                <w:sz w:val="22"/>
+                <w:szCs w:val="22"/>
+              </w:rPr>
+              <w:t xml:space="preserve"> </w:t>
+            </w:r>
+            <w:r>
+              <w:rPr>
+                <w:rFonts w:ascii="Calibri" w:hAnsi="Calibri" w:cs="Calibri"/>
+                <w:color w:val="000000"/>
+                <w:sz w:val="22"/>
+                <w:szCs w:val="22"/>
+              </w:rPr>
+              <w:t>}}</w:t>
+            </w:r>
+          </w:p>
+        </w:tc>
+        <w:tc>
+          <w:tcPr>
+            <w:tcW w:w="3414" w:type="dxa"/>
+            <w:tcBorders>
+              <w:top w:val="nil"/>
+              <w:left w:val="nil"/>
+              <w:bottom w:val="single" w:sz="4" w:space="0" w:color="auto"/>
+              <w:right w:val="single" w:sz="4" w:space="0" w:color="auto"/>
+            </w:tcBorders>
+            <w:noWrap/>
+            <w:vAlign w:val="bottom"/>
+            <w:hideMark/>
+          </w:tcPr>
+          <w:p>
+            <w:pPr>
+              <w:rPr>
+                <w:rFonts w:ascii="Calibri" w:hAnsi="Calibri" w:cs="Calibri"/>
+                <w:color w:val="000000"/>
+                <w:sz w:val="22"/>
+                <w:szCs w:val="22"/>
+              </w:rPr>
+            </w:pPr>
+            <w:r>
+              <w:rPr>
+                <w:rFonts w:ascii="Calibri" w:hAnsi="Calibri" w:cs="Calibri"/>
+                <w:color w:val="000000"/>
+                <w:sz w:val="22"/>
+                <w:szCs w:val="22"/>
+              </w:rPr>
+              <w:t> </w:t>
+            </w:r>
+          </w:p>
+        </w:tc>
+      </w:tr>
+    </w:tbl>
+    <w:p/>
+    <w:p/>
     <w:p>
       <w:pPr>
         <w:rPr>

</xml_diff>